<commit_message>
fix: refactor scrapers for high-speed concurrent fetching, fix broken policy links, clean invalid URLs and update web data
</commit_message>
<xml_diff>
--- a/reports/四川生物医药产业集团创新事业部政策信息简报_20260819.docx
+++ b/reports/四川生物医药产业集团创新事业部政策信息简报_20260819.docx
@@ -239,7 +239,7 @@
                 <w:color w:val="000000"/>
                 <w:sz w:val="24"/>
               </w:rPr>
-              <w:t>国家卫生健康委办公厅关于推进手术机器人与高端智能诊疗装备临床应用示范基地建设的通知</w:t>
+              <w:t>人力资源社会保障部等4部门关于支持海洋经济发展促进就业创业的通知</w:t>
             </w:r>
           </w:p>
         </w:tc>
@@ -268,7 +268,7 @@
                 <w:color w:val="000000"/>
                 <w:sz w:val="24"/>
               </w:rPr>
-              <w:t>国家卫生健康委</w:t>
+              <w:t>人力资源社会保障部 自然资源部 国家发展改革委 交通运输部</w:t>
             </w:r>
           </w:p>
         </w:tc>
@@ -297,7 +297,7 @@
                 <w:color w:val="000000"/>
                 <w:sz w:val="24"/>
               </w:rPr>
-              <w:t>2026-08-08</w:t>
+              <w:t>2026-06-16</w:t>
             </w:r>
           </w:p>
         </w:tc>
@@ -357,7 +357,7 @@
                 <w:color w:val="000000"/>
                 <w:sz w:val="24"/>
               </w:rPr>
-              <w:t>成都市科学技术局关于组织申报2026年成都市科技成果转化产学研医协同创新项目的通知</w:t>
+              <w:t>关于印发健全社会心理服务体系和危机干预机制实施方案的通知</w:t>
             </w:r>
           </w:p>
         </w:tc>
@@ -386,7 +386,7 @@
                 <w:color w:val="000000"/>
                 <w:sz w:val="24"/>
               </w:rPr>
-              <w:t>成都市科学技术局</w:t>
+              <w:t>国家卫生健康委 中央社会工作部 中央政法委 中央网信办 国家发展改革委 教育部 公安部 民政部 司法部 财政部 文化和旅游部 退役军人事务部 应急管理部 国务院国资委 市场监管总局 广电总局 体育总局 国家信访局 国家医保局 国家中医药局 国家疾控局 全国总工会 共青团中央 全国妇联 中国残联</w:t>
             </w:r>
           </w:p>
         </w:tc>
@@ -415,7 +415,7 @@
                 <w:color w:val="000000"/>
                 <w:sz w:val="24"/>
               </w:rPr>
-              <w:t>2026-08-07</w:t>
+              <w:t>2026-04-09</w:t>
             </w:r>
           </w:p>
         </w:tc>
@@ -475,7 +475,7 @@
                 <w:color w:val="000000"/>
                 <w:sz w:val="24"/>
               </w:rPr>
-              <w:t>人力资源社会保障部等九部门关于扩大新就业形态人员职业伤害保障试点的通知</w:t>
+              <w:t>国家药监局关于“人工智能+药品监管”的实施意见</w:t>
             </w:r>
           </w:p>
         </w:tc>
@@ -504,7 +504,7 @@
                 <w:color w:val="000000"/>
                 <w:sz w:val="24"/>
               </w:rPr>
-              <w:t>人力资源社会保障部 国家发展改革委 财政部 交通运输部 商务部 国家税务总局 市场监管总局 金融监管总局 全国总工会</w:t>
+              <w:t>国家药监局</w:t>
             </w:r>
           </w:p>
         </w:tc>
@@ -533,7 +533,7 @@
                 <w:color w:val="000000"/>
                 <w:sz w:val="24"/>
               </w:rPr>
-              <w:t>2025-07-09</w:t>
+              <w:t>2026-04-03</w:t>
             </w:r>
           </w:p>
         </w:tc>
@@ -593,7 +593,7 @@
                 <w:color w:val="000000"/>
                 <w:sz w:val="24"/>
               </w:rPr>
-              <w:t>关于全面推进分娩镇痛工作的通知</w:t>
+              <w:t>关于开展基层医疗卫生机构医疗质量改善三年行动（2026—2028年）的通知</w:t>
             </w:r>
           </w:p>
         </w:tc>
@@ -622,7 +622,7 @@
                 <w:color w:val="000000"/>
                 <w:sz w:val="24"/>
               </w:rPr>
-              <w:t>国家卫生健康委 国家中医药局 国家疾控局</w:t>
+              <w:t>国家卫生健康委办公厅 国家中医药局综合司</w:t>
             </w:r>
           </w:p>
         </w:tc>
@@ -651,7 +651,7 @@
                 <w:color w:val="000000"/>
                 <w:sz w:val="24"/>
               </w:rPr>
-              <w:t>2025-06-06</w:t>
+              <w:t>2026-04-01</w:t>
             </w:r>
           </w:p>
         </w:tc>
@@ -711,7 +711,7 @@
                 <w:color w:val="000000"/>
                 <w:sz w:val="24"/>
               </w:rPr>
-              <w:t>关于优化基层医疗卫生机构布局建设的指导意见</w:t>
+              <w:t>国家药监局关于印发药品现代物流规范化建设指导意见的通知</w:t>
             </w:r>
           </w:p>
         </w:tc>
@@ -740,7 +740,7 @@
                 <w:color w:val="000000"/>
                 <w:sz w:val="24"/>
               </w:rPr>
-              <w:t>国家卫生健康委等</w:t>
+              <w:t>国家药监局</w:t>
             </w:r>
           </w:p>
         </w:tc>
@@ -769,7 +769,7 @@
                 <w:color w:val="000000"/>
                 <w:sz w:val="24"/>
               </w:rPr>
-              <w:t>2025-05-02</w:t>
+              <w:t>2026-03-25</w:t>
             </w:r>
           </w:p>
         </w:tc>
@@ -829,7 +829,7 @@
                 <w:color w:val="000000"/>
                 <w:sz w:val="24"/>
               </w:rPr>
-              <w:t>工业和信息化部等七部门关于印发《医药工业数智化转型实施方案（2025—2030年）》的通知</w:t>
+              <w:t>关于印发乡镇卫生院 社区卫生服务中心中医药服务管理基本规范的通知</w:t>
             </w:r>
           </w:p>
         </w:tc>
@@ -858,7 +858,7 @@
                 <w:color w:val="000000"/>
                 <w:sz w:val="24"/>
               </w:rPr>
-              <w:t>工业和信息化部 商务部 国家卫生健康委 国家医保局 国家数据 国家中医药局 国家药监局</w:t>
+              <w:t>国家中医药局 国家卫生健康委 国家疾控局</w:t>
             </w:r>
           </w:p>
         </w:tc>
@@ -887,7 +887,7 @@
                 <w:color w:val="000000"/>
                 <w:sz w:val="24"/>
               </w:rPr>
-              <w:t>2025-04-24</w:t>
+              <w:t>2026-03-24</w:t>
             </w:r>
           </w:p>
         </w:tc>
@@ -947,7 +947,7 @@
                 <w:color w:val="000000"/>
                 <w:sz w:val="24"/>
               </w:rPr>
-              <w:t>关于印发《安全生产责任保险实施办法》的通知</w:t>
+              <w:t>商务部等9部门印发《关于促进旅行服务出口 扩大入境消费的政策措施》的通知</w:t>
             </w:r>
           </w:p>
         </w:tc>
@@ -976,7 +976,7 @@
                 <w:color w:val="000000"/>
                 <w:sz w:val="24"/>
               </w:rPr>
-              <w:t>应急管理部 财政部 金融监管总局 工业和信息化部 住房城乡建设部 交通运输部 农业农村部</w:t>
+              <w:t>商务部 中央网信办 外交部 教育部 文化和旅游部 国家卫生健康委 广电总局 体育总局 国家移民局</w:t>
             </w:r>
           </w:p>
         </w:tc>
@@ -1005,7 +1005,7 @@
                 <w:color w:val="000000"/>
                 <w:sz w:val="24"/>
               </w:rPr>
-              <w:t>2025-04-02</w:t>
+              <w:t>2026-03-21</w:t>
             </w:r>
           </w:p>
         </w:tc>
@@ -1065,7 +1065,7 @@
                 <w:color w:val="000000"/>
                 <w:sz w:val="24"/>
               </w:rPr>
-              <w:t>农业农村部落实中共中央国务院关于进一步深化农村改革扎实推进乡村全面振兴工作部署的实施意见</w:t>
+              <w:t>科技部 金融监管总局 工业和信息化部 国家知识产权局印发《关于加快推动科技保险高质量发展 有力支撑高水平科技自立自强的若干意见》的通知</w:t>
             </w:r>
           </w:p>
         </w:tc>
@@ -1094,7 +1094,7 @@
                 <w:color w:val="000000"/>
                 <w:sz w:val="24"/>
               </w:rPr>
-              <w:t>农业农村部</w:t>
+              <w:t>科技部 金融监管总局 工业和信息化部 国家知识产权局</w:t>
             </w:r>
           </w:p>
         </w:tc>
@@ -1123,7 +1123,7 @@
                 <w:color w:val="000000"/>
                 <w:sz w:val="24"/>
               </w:rPr>
-              <w:t>2025-02-25</w:t>
+              <w:t>2026-03-02</w:t>
             </w:r>
           </w:p>
         </w:tc>
@@ -1160,7 +1160,7 @@
           <w:color w:val="000000"/>
           <w:sz w:val="24"/>
         </w:rPr>
-        <w:t>1. 《国家卫生健康委办公厅关于推进手术机器人与高端智能诊疗装备临床应用示范基地建设的通知》（发布机关：国家卫生健康委，发布日期：2026-08-08）</w:t>
+        <w:t>1. 《人力资源社会保障部等4部门关于支持海洋经济发展促进就业创业的通知》（发布机关：人力资源社会保障部 自然资源部 国家发展改革委 交通运输部，发布日期：2026-06-16）</w:t>
       </w:r>
     </w:p>
     <w:p>
@@ -1177,7 +1177,7 @@
           <w:color w:val="000000"/>
           <w:sz w:val="24"/>
         </w:rPr>
-        <w:t>文件主要内容与核心要点：【临床示范与准入】国卫办医政发〔2026〕15号：支持国家区域医疗中心、大型公立三甲医院建立腹腔镜手术机器人、骨科导航机器人临床示范中心；优化手术机器人收费目录编码，加快物价立项与医保准入。</w:t>
+        <w:t>文件主要内容与核心要点：生物制品产业，支持涉海类高等学校、科研院所与企业深度合作，为海洋科研人员、医疗器械研发工程师等搭建研发推广平台，促进大健康产业高质量发展，吸纳更多高校毕业生等青年就业创业。着力提升海洋产业智能化、绿色化水平</w:t>
       </w:r>
       <w:r>
         <w:rPr>
@@ -1198,7 +1198,7 @@
           <w:sz w:val="24"/>
           <w:u w:val="single"/>
         </w:rPr>
-        <w:t>http://www.nhc.gov.cn/</w:t>
+        <w:t>https://www.gov.cn/zhengce/zhengceku/202606/content_7072347.htm</w:t>
       </w:r>
       <w:r>
         <w:rPr>
@@ -1225,7 +1225,7 @@
           <w:color w:val="000000"/>
           <w:sz w:val="24"/>
         </w:rPr>
-        <w:t>2. 《成都市科学技术局关于组织申报2026年成都市科技成果转化产学研医协同创新项目的通知》（发布机关：成都市科学技术局，发布日期：2026-08-07）</w:t>
+        <w:t>2. 《关于印发健全社会心理服务体系和危机干预机制实施方案的通知》（发布机关：国家卫生健康委 中央社会工作部 中央政法委 中央网信办 国家发展改革委 教育部 公安部 民政部 司法部 财政部 文化和旅游部 退役军人事务部 应急管理部 国务院国资委 市场监管总局 广电总局 体育总局 国家信访局 国家医保局 国家中医药局 国家疾控局 全国总工会 共青团中央 全国妇联 中国残联，发布日期：2026-04-09）</w:t>
       </w:r>
     </w:p>
     <w:p>
@@ -1242,7 +1242,7 @@
           <w:color w:val="000000"/>
           <w:sz w:val="24"/>
         </w:rPr>
-        <w:t>文件主要内容与核心要点：【产学研医资助最高300万】鼓励华西医院、四川大学、电子科大等高校院所与生物医药企业联合申报，围绕核医学、脑机接口、高端医疗器械开展成果就地转化，立项项目给予最高300万元前置经费资助。</w:t>
+        <w:t>文件主要内容与核心要点：精神障碍规范化、专业化诊疗水平，其他临床科室对常见心理健康问题早期识别、筛查和初步干预能力。（国家卫生健康委牵头，人力资源社会保障部、国家中医药局、国家疾控局等按职责分工负责） 3.规范社会心理咨询</w:t>
       </w:r>
       <w:r>
         <w:rPr>
@@ -1263,7 +1263,7 @@
           <w:sz w:val="24"/>
           <w:u w:val="single"/>
         </w:rPr>
-        <w:t>https://cdst.chengdu.gov.cn/</w:t>
+        <w:t>https://www.gov.cn/zhengce/zhengceku/202604/content_7065035.htm</w:t>
       </w:r>
       <w:r>
         <w:rPr>
@@ -1290,7 +1290,7 @@
           <w:color w:val="000000"/>
           <w:sz w:val="24"/>
         </w:rPr>
-        <w:t>3. 《人力资源社会保障部等九部门关于扩大新就业形态人员职业伤害保障试点的通知》（发布机关：人力资源社会保障部 国家发展改革委 财政部 交通运输部 商务部 国家税务总局 市场监管总局 金融监管总局 全国总工会，发布日期：2025-07-09）</w:t>
+        <w:t>3. 《国家药监局关于“人工智能+药品监管”的实施意见》（发布机关：国家药监局，发布日期：2026-04-03）</w:t>
       </w:r>
     </w:p>
     <w:p>
@@ -1307,7 +1307,7 @@
           <w:color w:val="000000"/>
           <w:sz w:val="24"/>
         </w:rPr>
-        <w:t>文件主要内容与核心要点：伤害医疗待遇。 治疗职业伤害按照工伤保险诊疗项目目录、工伤保险药品目录、工伤保险住院服务标准执行。新就业形态人员治疗职业伤害应当在签订工伤医疗服务协议的医疗机构就医，情况紧急时可以先到就近的医疗机构急救</w:t>
+        <w:t>文件主要内容与核心要点：【AI监管与算法审查】加快人工智能、大模型技术在药品全生命周期监管中的赋能应用，优化AI制药与辅助设计审评审批流程，支持智能药械企业合规创新与算法验证。</w:t>
       </w:r>
       <w:r>
         <w:rPr>
@@ -1328,7 +1328,7 @@
           <w:sz w:val="24"/>
           <w:u w:val="single"/>
         </w:rPr>
-        <w:t>https://www.nmpa.gov.cn/</w:t>
+        <w:t>https://www.gov.cn/zhengce/zhengceku/202604/content_7064591.htm</w:t>
       </w:r>
       <w:r>
         <w:rPr>
@@ -1355,7 +1355,7 @@
           <w:color w:val="000000"/>
           <w:sz w:val="24"/>
         </w:rPr>
-        <w:t>4. 《关于全面推进分娩镇痛工作的通知》（发布机关：国家卫生健康委 国家中医药局 国家疾控局，发布日期：2025-06-06）</w:t>
+        <w:t>4. 《关于开展基层医疗卫生机构医疗质量改善三年行动（2026—2028年）的通知》（发布机关：国家卫生健康委办公厅 国家中医药局综合司，发布日期：2026-04-01）</w:t>
       </w:r>
     </w:p>
     <w:p>
@@ -1372,7 +1372,7 @@
           <w:color w:val="000000"/>
           <w:sz w:val="24"/>
         </w:rPr>
-        <w:t>文件主要内容与核心要点：设施建设和设备药品配置，强化分娩镇痛相关专业技术人员培养，为提供分娩镇痛服务打好基础、完善条件。 （二）建立产科与麻醉科协作机制。开展分娩镇痛的医疗机构要加强产科与麻醉科的协作联动，根据产科分娩镇痛</w:t>
+        <w:t>文件主要内容与核心要点：护士、医技人员以及乡村医生执业管理，开展全员医疗质量管理制度培训，以临床诊疗指南、技术规范、操作规程、药品临床应用指南等为重点，对全体医务人员加强基本理论、基本知识、基本技能培训及考核，不断提升</w:t>
       </w:r>
       <w:r>
         <w:rPr>
@@ -1393,7 +1393,7 @@
           <w:sz w:val="24"/>
           <w:u w:val="single"/>
         </w:rPr>
-        <w:t>http://www.nhc.gov.cn/</w:t>
+        <w:t>https://www.gov.cn/zhengce/zhengceku/202604/content_7064456.htm</w:t>
       </w:r>
       <w:r>
         <w:rPr>
@@ -1420,7 +1420,7 @@
           <w:color w:val="000000"/>
           <w:sz w:val="24"/>
         </w:rPr>
-        <w:t>5. 《关于优化基层医疗卫生机构布局建设的指导意见》（发布机关：国家卫生健康委等，发布日期：2025-05-02）</w:t>
+        <w:t>5. 《国家药监局关于印发药品现代物流规范化建设指导意见的通知》（发布机关：国家药监局，发布日期：2026-03-25）</w:t>
       </w:r>
     </w:p>
     <w:p>
@@ -1437,7 +1437,7 @@
           <w:color w:val="000000"/>
           <w:sz w:val="24"/>
         </w:rPr>
-        <w:t>文件主要内容与核心要点：关于优化基层医疗卫生机构布局建设的指导意见 国卫基层发〔2025〕2号 各省、自治区、直辖市及新疆生产建设兵团卫生健康委、党委编办、发展改革委、教育厅（局）、民政厅（局）、财政厅（局）、</w:t>
+        <w:t>文件主要内容与核心要点：国家药监局关于印发药品现代物流规范化建设指导意见的通知 国药监药管〔2026〕7号 各省、自治区、直辖市和新疆生产建设兵团药品监督管理局： 为贯彻落实《国务院办公厅关于全面深化药品医疗器械监管改革</w:t>
       </w:r>
       <w:r>
         <w:rPr>
@@ -1458,7 +1458,7 @@
           <w:sz w:val="24"/>
           <w:u w:val="single"/>
         </w:rPr>
-        <w:t>http://www.nhc.gov.cn/</w:t>
+        <w:t>https://www.gov.cn/zhengce/zhengceku/202603/content_7063751.htm</w:t>
       </w:r>
       <w:r>
         <w:rPr>
@@ -1485,7 +1485,7 @@
           <w:color w:val="000000"/>
           <w:sz w:val="24"/>
         </w:rPr>
-        <w:t>6. 《工业和信息化部等七部门关于印发《医药工业数智化转型实施方案（2025—2030年）》的通知》（发布机关：工业和信息化部 商务部 国家卫生健康委 国家医保局 国家数据 国家中医药局 国家药监局，发布日期：2025-04-24）</w:t>
+        <w:t>6. 《关于印发乡镇卫生院 社区卫生服务中心中医药服务管理基本规范的通知》（发布机关：国家中医药局 国家卫生健康委 国家疾控局，发布日期：2026-03-24）</w:t>
       </w:r>
     </w:p>
     <w:p>
@@ -1502,7 +1502,7 @@
           <w:color w:val="000000"/>
           <w:sz w:val="24"/>
         </w:rPr>
-        <w:t>文件主要内容与核心要点：落实《医药工业高质量发展行动计划（2023—2025年）》《制造业数字化转型行动方案》《关于全面深化药品医疗器械监管改革促进医药产业高质量发展的意见》，深入推进人工智能赋能新型工业化，推动新一代信息技术</w:t>
+        <w:t>文件主要内容与核心要点：管理基本规范》，现印发给你们，请逐级抓好责任落实，全面巩固拓展中医馆建设等基层中医药服务发展成效，推动基层医疗卫生机构中医药服务高质量发展。 国家中医药局 国家卫生健康委 国家疾控局 2026年3月11</w:t>
       </w:r>
       <w:r>
         <w:rPr>
@@ -1523,7 +1523,7 @@
           <w:sz w:val="24"/>
           <w:u w:val="single"/>
         </w:rPr>
-        <w:t>https://www.nmpa.gov.cn/</w:t>
+        <w:t>https://www.gov.cn/zhengce/zhengceku/202603/content_7063623.htm</w:t>
       </w:r>
       <w:r>
         <w:rPr>
@@ -1550,7 +1550,7 @@
           <w:color w:val="000000"/>
           <w:sz w:val="24"/>
         </w:rPr>
-        <w:t>7. 《关于印发《安全生产责任保险实施办法》的通知》（发布机关：应急管理部 财政部 金融监管总局 工业和信息化部 住房城乡建设部 交通运输部 农业农村部，发布日期：2025-04-02）</w:t>
+        <w:t>7. 《商务部等9部门印发《关于促进旅行服务出口 扩大入境消费的政策措施》的通知》（发布机关：商务部 中央网信办 外交部 教育部 文化和旅游部 国家卫生健康委 广电总局 体育总局 国家移民局，发布日期：2026-03-21）</w:t>
       </w:r>
     </w:p>
     <w:p>
@@ -1567,7 +1567,7 @@
           <w:color w:val="000000"/>
           <w:sz w:val="24"/>
         </w:rPr>
-        <w:t>文件主要内容与核心要点：、医疗救护、事故鉴定、法律诉讼等费用。 第四条 保险机构为高危行业、领域单位承保安责险，应当按照相关规定和合同约定提供事故预防服务。 第五条 规范安责险和道路运输承运人责任险的衔接，优化保险产品设计，</w:t>
+        <w:t>文件主要内容与核心要点：有条件的地区探索建设国际医疗旅游集聚区，面向国际患者提供高端体检、整形美容、康复护理等服务。发挥海南博鳌乐城国际医疗旅游先行区示范带动作用，允许国外上市且我国尚无同品种产品获准注册的临床急需药品（不含</w:t>
       </w:r>
       <w:r>
         <w:rPr>
@@ -1588,7 +1588,7 @@
           <w:sz w:val="24"/>
           <w:u w:val="single"/>
         </w:rPr>
-        <w:t>https://www.nmpa.gov.cn/</w:t>
+        <w:t>https://www.gov.cn/zhengce/zhengceku/202603/content_7063374.htm</w:t>
       </w:r>
       <w:r>
         <w:rPr>
@@ -1615,7 +1615,7 @@
           <w:color w:val="000000"/>
           <w:sz w:val="24"/>
         </w:rPr>
-        <w:t>8. 《农业农村部落实中共中央国务院关于进一步深化农村改革扎实推进乡村全面振兴工作部署的实施意见》（发布机关：农业农村部，发布日期：2025-02-25）</w:t>
+        <w:t>8. 《科技部 金融监管总局 工业和信息化部 国家知识产权局印发《关于加快推动科技保险高质量发展 有力支撑高水平科技自立自强的若干意见》的通知》（发布机关：科技部 金融监管总局 工业和信息化部 国家知识产权局，发布日期：2026-03-02）</w:t>
       </w:r>
     </w:p>
     <w:p>
@@ -1632,7 +1632,7 @@
           <w:color w:val="000000"/>
           <w:sz w:val="24"/>
         </w:rPr>
-        <w:t>文件主要内容与核心要点：，坚持城乡融合发展，锚定推进乡村全面振兴、建设农业强国目标，以改革开放和科技创新为动力，巩固和完善农村基本经营制度，深入学习运用“千万工程”经验，确保国家粮食安全，确保不发生规模性返贫致贫，提升乡村</w:t>
+        <w:t>文件主要内容与核心要点：适度提高产品创新包容性，优化科技保险产品备案管理。在人工智能、集成电路、量子科技、生物制造、氢能和核聚变能、脑机接口、具身智能等重点科技和产业发展领域，鼓励开发科技保险专属产品，探索建立专项风险准备金</w:t>
       </w:r>
       <w:r>
         <w:rPr>
@@ -1653,7 +1653,7 @@
           <w:sz w:val="24"/>
           <w:u w:val="single"/>
         </w:rPr>
-        <w:t>https://www.nmpa.gov.cn/</w:t>
+        <w:t>https://www.gov.cn/zhengce/zhengceku/202603/content_7060189.htm</w:t>
       </w:r>
       <w:r>
         <w:rPr>

</xml_diff>

<commit_message>
fix: update track badges to display recent update counts rather than full historical totals
</commit_message>
<xml_diff>
--- a/reports/四川生物医药产业集团创新事业部政策信息简报_20260819.docx
+++ b/reports/四川生物医药产业集团创新事业部政策信息简报_20260819.docx
@@ -357,7 +357,7 @@
                 <w:color w:val="000000"/>
                 <w:sz w:val="24"/>
               </w:rPr>
-              <w:t>关于印发健全社会心理服务体系和危机干预机制实施方案的通知</w:t>
+              <w:t>工业和信息化部等八部门关于印发《中药工业高质量发展实施方案（2026—2030年）》的通知</w:t>
             </w:r>
           </w:p>
         </w:tc>
@@ -386,7 +386,7 @@
                 <w:color w:val="000000"/>
                 <w:sz w:val="24"/>
               </w:rPr>
-              <w:t>国家卫生健康委 中央社会工作部 中央政法委 中央网信办 国家发展改革委 教育部 公安部 民政部 司法部 财政部 文化和旅游部 退役军人事务部 应急管理部 国务院国资委 市场监管总局 广电总局 体育总局 国家信访局 国家医保局 国家中医药局 国家疾控局 全国总工会 共青团中央 全国妇联 中国残联</w:t>
+              <w:t>工业和信息化部 国家民委 农业农村部 国家卫生健康委 国务院国资委 金融监管总局 国家中医药局 国家药监局</w:t>
             </w:r>
           </w:p>
         </w:tc>
@@ -415,7 +415,7 @@
                 <w:color w:val="000000"/>
                 <w:sz w:val="24"/>
               </w:rPr>
-              <w:t>2026-04-09</w:t>
+              <w:t>2026-02-05</w:t>
             </w:r>
           </w:p>
         </w:tc>
@@ -475,7 +475,7 @@
                 <w:color w:val="000000"/>
                 <w:sz w:val="24"/>
               </w:rPr>
-              <w:t>国家药监局关于“人工智能+药品监管”的实施意见</w:t>
+              <w:t>商务部等9部门关于促进药品零售行业高质量发展的意见</w:t>
             </w:r>
           </w:p>
         </w:tc>
@@ -504,7 +504,7 @@
                 <w:color w:val="000000"/>
                 <w:sz w:val="24"/>
               </w:rPr>
-              <w:t>国家药监局</w:t>
+              <w:t>商务部 国家发展改革委 工业和信息化部 国家卫生健康委 市场监管总局 金融监管总局 国家医保局 国家中医药局 国家药监局</w:t>
             </w:r>
           </w:p>
         </w:tc>
@@ -533,7 +533,7 @@
                 <w:color w:val="000000"/>
                 <w:sz w:val="24"/>
               </w:rPr>
-              <w:t>2026-04-03</w:t>
+              <w:t>2026-01-22</w:t>
             </w:r>
           </w:p>
         </w:tc>
@@ -593,7 +593,7 @@
                 <w:color w:val="000000"/>
                 <w:sz w:val="24"/>
               </w:rPr>
-              <w:t>关于开展基层医疗卫生机构医疗质量改善三年行动（2026—2028年）的通知</w:t>
+              <w:t>关于实施中小微企业贷款贴息政策的通知</w:t>
             </w:r>
           </w:p>
         </w:tc>
@@ -622,7 +622,7 @@
                 <w:color w:val="000000"/>
                 <w:sz w:val="24"/>
               </w:rPr>
-              <w:t>国家卫生健康委办公厅 国家中医药局综合司</w:t>
+              <w:t>财政部 国家发展改革委 工业和信息化部 中国人民银行 金融监管总局</w:t>
             </w:r>
           </w:p>
         </w:tc>
@@ -651,7 +651,7 @@
                 <w:color w:val="000000"/>
                 <w:sz w:val="24"/>
               </w:rPr>
-              <w:t>2026-04-01</w:t>
+              <w:t>2026-01-21</w:t>
             </w:r>
           </w:p>
         </w:tc>
@@ -711,7 +711,7 @@
                 <w:color w:val="000000"/>
                 <w:sz w:val="24"/>
               </w:rPr>
-              <w:t>国家药监局关于印发药品现代物流规范化建设指导意见的通知</w:t>
+              <w:t>中国气象局 民政部 文化和旅游部 国家医疗保障局 国家林业和草原局 国家中医药管理局 国家疾病预防控制局关于加强协同联动 推进康养气象服务高质量发展的指导意见</w:t>
             </w:r>
           </w:p>
         </w:tc>
@@ -740,7 +740,7 @@
                 <w:color w:val="000000"/>
                 <w:sz w:val="24"/>
               </w:rPr>
-              <w:t>国家药监局</w:t>
+              <w:t>中国气象局 民政部 文化和旅游部 国家医保局 国家林草局 国家中医药局 国家疾控局</w:t>
             </w:r>
           </w:p>
         </w:tc>
@@ -769,7 +769,7 @@
                 <w:color w:val="000000"/>
                 <w:sz w:val="24"/>
               </w:rPr>
-              <w:t>2026-03-25</w:t>
+              <w:t>2026-01-14</w:t>
             </w:r>
           </w:p>
         </w:tc>
@@ -829,7 +829,7 @@
                 <w:color w:val="000000"/>
                 <w:sz w:val="24"/>
               </w:rPr>
-              <w:t>关于印发乡镇卫生院 社区卫生服务中心中医药服务管理基本规范的通知</w:t>
+              <w:t>国家发展改革委 财政部关于2026年实施大规模设备更新和消费品以旧换新政策的通知</w:t>
             </w:r>
           </w:p>
         </w:tc>
@@ -858,7 +858,7 @@
                 <w:color w:val="000000"/>
                 <w:sz w:val="24"/>
               </w:rPr>
-              <w:t>国家中医药局 国家卫生健康委 国家疾控局</w:t>
+              <w:t>国家发展改革委 财政部</w:t>
             </w:r>
           </w:p>
         </w:tc>
@@ -887,7 +887,7 @@
                 <w:color w:val="000000"/>
                 <w:sz w:val="24"/>
               </w:rPr>
-              <w:t>2026-03-24</w:t>
+              <w:t>2025-12-30</w:t>
             </w:r>
           </w:p>
         </w:tc>
@@ -947,7 +947,7 @@
                 <w:color w:val="000000"/>
                 <w:sz w:val="24"/>
               </w:rPr>
-              <w:t>商务部等9部门印发《关于促进旅行服务出口 扩大入境消费的政策措施》的通知</w:t>
+              <w:t>关于印发儿童青少年“五健”促进行动计划（2026—2030年）的通知</w:t>
             </w:r>
           </w:p>
         </w:tc>
@@ -976,7 +976,7 @@
                 <w:color w:val="000000"/>
                 <w:sz w:val="24"/>
               </w:rPr>
-              <w:t>商务部 中央网信办 外交部 教育部 文化和旅游部 国家卫生健康委 广电总局 体育总局 国家移民局</w:t>
+              <w:t>国家卫生健康委 国家疾控局 中央网信办 国家发展改革委 教育部 财政部 国家广电总局 国家体育总局 国家中医药局 国务院妇儿工委办公室 共青团中央 全国妇联 中国残联</w:t>
             </w:r>
           </w:p>
         </w:tc>
@@ -1005,7 +1005,7 @@
                 <w:color w:val="000000"/>
                 <w:sz w:val="24"/>
               </w:rPr>
-              <w:t>2026-03-21</w:t>
+              <w:t>2025-12-30</w:t>
             </w:r>
           </w:p>
         </w:tc>
@@ -1065,7 +1065,7 @@
                 <w:color w:val="000000"/>
                 <w:sz w:val="24"/>
               </w:rPr>
-              <w:t>科技部 金融监管总局 工业和信息化部 国家知识产权局印发《关于加快推动科技保险高质量发展 有力支撑高水平科技自立自强的若干意见》的通知</w:t>
+              <w:t>国家药监局关于发布医疗器械出口销售证明管理规定的公告</w:t>
             </w:r>
           </w:p>
         </w:tc>
@@ -1094,7 +1094,7 @@
                 <w:color w:val="000000"/>
                 <w:sz w:val="24"/>
               </w:rPr>
-              <w:t>科技部 金融监管总局 工业和信息化部 国家知识产权局</w:t>
+              <w:t>国家药监局</w:t>
             </w:r>
           </w:p>
         </w:tc>
@@ -1123,7 +1123,7 @@
                 <w:color w:val="000000"/>
                 <w:sz w:val="24"/>
               </w:rPr>
-              <w:t>2026-03-02</w:t>
+              <w:t>2025-12-25</w:t>
             </w:r>
           </w:p>
         </w:tc>
@@ -1225,7 +1225,7 @@
           <w:color w:val="000000"/>
           <w:sz w:val="24"/>
         </w:rPr>
-        <w:t>2. 《关于印发健全社会心理服务体系和危机干预机制实施方案的通知》（发布机关：国家卫生健康委 中央社会工作部 中央政法委 中央网信办 国家发展改革委 教育部 公安部 民政部 司法部 财政部 文化和旅游部 退役军人事务部 应急管理部 国务院国资委 市场监管总局 广电总局 体育总局 国家信访局 国家医保局 国家中医药局 国家疾控局 全国总工会 共青团中央 全国妇联 中国残联，发布日期：2026-04-09）</w:t>
+        <w:t>2. 《工业和信息化部等八部门关于印发《中药工业高质量发展实施方案（2026—2030年）》的通知》（发布机关：工业和信息化部 国家民委 农业农村部 国家卫生健康委 国务院国资委 金融监管总局 国家中医药局 国家药监局，发布日期：2026-02-05）</w:t>
       </w:r>
     </w:p>
     <w:p>
@@ -1242,7 +1242,7 @@
           <w:color w:val="000000"/>
           <w:sz w:val="24"/>
         </w:rPr>
-        <w:t>文件主要内容与核心要点：精神障碍规范化、专业化诊疗水平，其他临床科室对常见心理健康问题早期识别、筛查和初步干预能力。（国家卫生健康委牵头，人力资源社会保障部、国家中医药局、国家疾控局等按职责分工负责） 3.规范社会心理咨询</w:t>
+        <w:t>文件主要内容与核心要点：工业和信息化部等八部门关于印发《中药工业高质量发展实施方案（2026—2030年）》的通知 工信部联消费〔2026〕33号 各省、自治区、直辖市、新疆生产建设兵团工业和信息化、民族、农业农村、卫生健康...</w:t>
       </w:r>
       <w:r>
         <w:rPr>
@@ -1263,7 +1263,7 @@
           <w:sz w:val="24"/>
           <w:u w:val="single"/>
         </w:rPr>
-        <w:t>https://www.gov.cn/zhengce/zhengceku/202604/content_7065035.htm</w:t>
+        <w:t>https://www.gov.cn/zhengce/zhengceku/202602/content_7057174.htm</w:t>
       </w:r>
       <w:r>
         <w:rPr>
@@ -1290,7 +1290,7 @@
           <w:color w:val="000000"/>
           <w:sz w:val="24"/>
         </w:rPr>
-        <w:t>3. 《国家药监局关于“人工智能+药品监管”的实施意见》（发布机关：国家药监局，发布日期：2026-04-03）</w:t>
+        <w:t>3. 《商务部等9部门关于促进药品零售行业高质量发展的意见》（发布机关：商务部 国家发展改革委 工业和信息化部 国家卫生健康委 市场监管总局 金融监管总局 国家医保局 国家中医药局 国家药监局，发布日期：2026-01-22）</w:t>
       </w:r>
     </w:p>
     <w:p>
@@ -1307,7 +1307,7 @@
           <w:color w:val="000000"/>
           <w:sz w:val="24"/>
         </w:rPr>
-        <w:t>文件主要内容与核心要点：【AI监管与算法审查】加快人工智能、大模型技术在药品全生命周期监管中的赋能应用，优化AI制药与辅助设计审评审批流程，支持智能药械企业合规创新与算法验证。</w:t>
+        <w:t>文件主要内容与核心要点：流转机制，加强流程追溯，优化结算规则，提升电子处方流转平台使用效能。鼓励符合监管要求的实体医疗机构、互联网医院与药品零售企业依托电子处方流转平台进行处方流转。鼓励建设非医保药品自费处方电子流转平台，</w:t>
       </w:r>
       <w:r>
         <w:rPr>
@@ -1328,7 +1328,7 @@
           <w:sz w:val="24"/>
           <w:u w:val="single"/>
         </w:rPr>
-        <w:t>https://www.gov.cn/zhengce/zhengceku/202604/content_7064591.htm</w:t>
+        <w:t>https://www.gov.cn/zhengce/zhengceku/202601/content_7055835.htm</w:t>
       </w:r>
       <w:r>
         <w:rPr>
@@ -1355,7 +1355,7 @@
           <w:color w:val="000000"/>
           <w:sz w:val="24"/>
         </w:rPr>
-        <w:t>4. 《关于开展基层医疗卫生机构医疗质量改善三年行动（2026—2028年）的通知》（发布机关：国家卫生健康委办公厅 国家中医药局综合司，发布日期：2026-04-01）</w:t>
+        <w:t>4. 《关于实施中小微企业贷款贴息政策的通知》（发布机关：财政部 国家发展改革委 工业和信息化部 中国人民银行 金融监管总局，发布日期：2026-01-21）</w:t>
       </w:r>
     </w:p>
     <w:p>
@@ -1372,7 +1372,7 @@
           <w:color w:val="000000"/>
           <w:sz w:val="24"/>
         </w:rPr>
-        <w:t>文件主要内容与核心要点：护士、医技人员以及乡村医生执业管理，开展全员医疗质量管理制度培训，以临床诊疗指南、技术规范、操作规程、药品临床应用指南等为重点，对全体医务人员加强基本理论、基本知识、基本技能培训及考核，不断提升</w:t>
+        <w:t>文件主要内容与核心要点：企业融资协调工作机制推荐或由工业和信息化部共享的优质中小微民营企业）固定资产贷款，中小微民营企业参与项目使用的新型政策性金融工具资金。 （二）投向领域。支持新能源汽车、工业母机、医药工业、医疗装备、基础</w:t>
       </w:r>
       <w:r>
         <w:rPr>
@@ -1393,7 +1393,7 @@
           <w:sz w:val="24"/>
           <w:u w:val="single"/>
         </w:rPr>
-        <w:t>https://www.gov.cn/zhengce/zhengceku/202604/content_7064456.htm</w:t>
+        <w:t>https://www.gov.cn/zhengce/zhengceku/202601/content_7055567.htm</w:t>
       </w:r>
       <w:r>
         <w:rPr>
@@ -1420,7 +1420,7 @@
           <w:color w:val="000000"/>
           <w:sz w:val="24"/>
         </w:rPr>
-        <w:t>5. 《国家药监局关于印发药品现代物流规范化建设指导意见的通知》（发布机关：国家药监局，发布日期：2026-03-25）</w:t>
+        <w:t>5. 《中国气象局 民政部 文化和旅游部 国家医疗保障局 国家林业和草原局 国家中医药管理局 国家疾病预防控制局关于加强协同联动 推进康养气象服务高质量发展的指导意见》（发布机关：中国气象局 民政部 文化和旅游部 国家医保局 国家林草局 国家中医药局 国家疾控局，发布日期：2026-01-14）</w:t>
       </w:r>
     </w:p>
     <w:p>
@@ -1437,7 +1437,7 @@
           <w:color w:val="000000"/>
           <w:sz w:val="24"/>
         </w:rPr>
-        <w:t>文件主要内容与核心要点：国家药监局关于印发药品现代物流规范化建设指导意见的通知 国药监药管〔2026〕7号 各省、自治区、直辖市和新疆生产建设兵团药品监督管理局： 为贯彻落实《国务院办公厅关于全面深化药品医疗器械监管改革</w:t>
+        <w:t>文件主要内容与核心要点：风险趋势分析，为医疗保障政策调整、定点医疗机构资源规划配置等提供决策支撑。开展医疗保障气象健康风险预警与医疗费用支出相关性研究，探索构建医疗保障气象健康风险预警与医保支出预测联动平台。 10.开发气象</w:t>
       </w:r>
       <w:r>
         <w:rPr>
@@ -1458,7 +1458,7 @@
           <w:sz w:val="24"/>
           <w:u w:val="single"/>
         </w:rPr>
-        <w:t>https://www.gov.cn/zhengce/zhengceku/202603/content_7063751.htm</w:t>
+        <w:t>https://www.gov.cn/zhengce/zhengceku/202601/content_7054707.htm</w:t>
       </w:r>
       <w:r>
         <w:rPr>
@@ -1485,7 +1485,7 @@
           <w:color w:val="000000"/>
           <w:sz w:val="24"/>
         </w:rPr>
-        <w:t>6. 《关于印发乡镇卫生院 社区卫生服务中心中医药服务管理基本规范的通知》（发布机关：国家中医药局 国家卫生健康委 国家疾控局，发布日期：2026-03-24）</w:t>
+        <w:t>6. 《国家发展改革委 财政部关于2026年实施大规模设备更新和消费品以旧换新政策的通知》（发布机关：国家发展改革委 财政部，发布日期：2025-12-30）</w:t>
       </w:r>
     </w:p>
     <w:p>
@@ -1502,7 +1502,7 @@
           <w:color w:val="000000"/>
           <w:sz w:val="24"/>
         </w:rPr>
-        <w:t>文件主要内容与核心要点：管理基本规范》，现印发给你们，请逐级抓好责任落实，全面巩固拓展中医馆建设等基层中医药服务发展成效，推动基层医疗卫生机构中医药服务高质量发展。 国家中医药局 国家卫生健康委 国家疾控局 2026年3月11</w:t>
+        <w:t>文件主要内容与核心要点：一、推进大规模设备更新 （一）支持设备更新项目。在继续支持工业、电子信息、能源电力、交通运输、物流、教育、文旅、医疗、设施农业、粮油加工、安全生产、海关查验、住宅老旧电梯、节能降碳环保等领域设备更新</w:t>
       </w:r>
       <w:r>
         <w:rPr>
@@ -1523,7 +1523,7 @@
           <w:sz w:val="24"/>
           <w:u w:val="single"/>
         </w:rPr>
-        <w:t>https://www.gov.cn/zhengce/zhengceku/202603/content_7063623.htm</w:t>
+        <w:t>https://www.gov.cn/zhengce/zhengceku/202512/content_7053236.htm</w:t>
       </w:r>
       <w:r>
         <w:rPr>
@@ -1550,7 +1550,7 @@
           <w:color w:val="000000"/>
           <w:sz w:val="24"/>
         </w:rPr>
-        <w:t>7. 《商务部等9部门印发《关于促进旅行服务出口 扩大入境消费的政策措施》的通知》（发布机关：商务部 中央网信办 外交部 教育部 文化和旅游部 国家卫生健康委 广电总局 体育总局 国家移民局，发布日期：2026-03-21）</w:t>
+        <w:t>7. 《关于印发儿童青少年“五健”促进行动计划（2026—2030年）的通知》（发布机关：国家卫生健康委 国家疾控局 中央网信办 国家发展改革委 教育部 财政部 国家广电总局 国家体育总局 国家中医药局 国务院妇儿工委办公室 共青团中央 全国妇联 中国残联，发布日期：2025-12-30）</w:t>
       </w:r>
     </w:p>
     <w:p>
@@ -1567,7 +1567,7 @@
           <w:color w:val="000000"/>
           <w:sz w:val="24"/>
         </w:rPr>
-        <w:t>文件主要内容与核心要点：有条件的地区探索建设国际医疗旅游集聚区，面向国际患者提供高端体检、整形美容、康复护理等服务。发挥海南博鳌乐城国际医疗旅游先行区示范带动作用，允许国外上市且我国尚无同品种产品获准注册的临床急需药品（不含</w:t>
+        <w:t>文件主要内容与核心要点：中小学生国家学生体质健康标准达标优良率达到60%以上。 （2）儿童青少年肥胖得到有效干预。 2.行动内容： （1）加强孕期体重管理。医疗机构将体重管理纳入早孕关爱和孕产期保健服务，充实孕妇学校课程。加强孕期</w:t>
       </w:r>
       <w:r>
         <w:rPr>
@@ -1588,7 +1588,7 @@
           <w:sz w:val="24"/>
           <w:u w:val="single"/>
         </w:rPr>
-        <w:t>https://www.gov.cn/zhengce/zhengceku/202603/content_7063374.htm</w:t>
+        <w:t>https://www.gov.cn/zhengce/zhengceku/202512/content_7053270.htm</w:t>
       </w:r>
       <w:r>
         <w:rPr>
@@ -1615,7 +1615,7 @@
           <w:color w:val="000000"/>
           <w:sz w:val="24"/>
         </w:rPr>
-        <w:t>8. 《科技部 金融监管总局 工业和信息化部 国家知识产权局印发《关于加快推动科技保险高质量发展 有力支撑高水平科技自立自强的若干意见》的通知》（发布机关：科技部 金融监管总局 工业和信息化部 国家知识产权局，发布日期：2026-03-02）</w:t>
+        <w:t>8. 《国家药监局关于发布医疗器械出口销售证明管理规定的公告》（发布机关：国家药监局，发布日期：2025-12-25）</w:t>
       </w:r>
     </w:p>
     <w:p>
@@ -1632,7 +1632,7 @@
           <w:color w:val="000000"/>
           <w:sz w:val="24"/>
         </w:rPr>
-        <w:t>文件主要内容与核心要点：适度提高产品创新包容性，优化科技保险产品备案管理。在人工智能、集成电路、量子科技、生物制造、氢能和核聚变能、脑机接口、具身智能等重点科技和产业发展领域，鼓励开发科技保险专属产品，探索建立专项风险准备金</w:t>
+        <w:t>文件主要内容与核心要点：国家药监局关于发布医疗器械出口销售证明管理规定的公告 2025年第126号 为支持医疗器械出口贸易，规范药品监督管理部门出具医疗器械出口销售证明的服务性事项办理，国家药监局修订发布《医疗器械出口销售</w:t>
       </w:r>
       <w:r>
         <w:rPr>
@@ -1653,7 +1653,7 @@
           <w:sz w:val="24"/>
           <w:u w:val="single"/>
         </w:rPr>
-        <w:t>https://www.gov.cn/zhengce/zhengceku/202603/content_7060189.htm</w:t>
+        <w:t>https://www.gov.cn/zhengce/zhengceku/202512/content_7052743.htm</w:t>
       </w:r>
       <w:r>
         <w:rPr>

</xml_diff>

<commit_message>
fix: refactor policy classification engine to prevent false AI/robotics tagging and purge non-pharma noise
</commit_message>
<xml_diff>
--- a/reports/四川生物医药产业集团创新事业部政策信息简报_20260819.docx
+++ b/reports/四川生物医药产业集团创新事业部政策信息简报_20260819.docx
@@ -357,7 +357,7 @@
                 <w:color w:val="000000"/>
                 <w:sz w:val="24"/>
               </w:rPr>
-              <w:t>工业和信息化部等八部门关于印发《中药工业高质量发展实施方案（2026—2030年）》的通知</w:t>
+              <w:t>国家药监局关于发布互联网药品医疗器械信息服务备案管理规定的公告</w:t>
             </w:r>
           </w:p>
         </w:tc>
@@ -386,7 +386,7 @@
                 <w:color w:val="000000"/>
                 <w:sz w:val="24"/>
               </w:rPr>
-              <w:t>工业和信息化部 国家民委 农业农村部 国家卫生健康委 国务院国资委 金融监管总局 国家中医药局 国家药监局</w:t>
+              <w:t>国家药监局</w:t>
             </w:r>
           </w:p>
         </w:tc>
@@ -415,7 +415,7 @@
                 <w:color w:val="000000"/>
                 <w:sz w:val="24"/>
               </w:rPr>
-              <w:t>2026-02-05</w:t>
+              <w:t>2025-12-23</w:t>
             </w:r>
           </w:p>
         </w:tc>
@@ -475,7 +475,7 @@
                 <w:color w:val="000000"/>
                 <w:sz w:val="24"/>
               </w:rPr>
-              <w:t>商务部等9部门关于促进药品零售行业高质量发展的意见</w:t>
+              <w:t>海关总署关于印发《海关支持和服务横琴粤澳深度合作区建设新一轮措施》的通知</w:t>
             </w:r>
           </w:p>
         </w:tc>
@@ -504,7 +504,7 @@
                 <w:color w:val="000000"/>
                 <w:sz w:val="24"/>
               </w:rPr>
-              <w:t>商务部 国家发展改革委 工业和信息化部 国家卫生健康委 市场监管总局 金融监管总局 国家医保局 国家中医药局 国家药监局</w:t>
+              <w:t>海关总署</w:t>
             </w:r>
           </w:p>
         </w:tc>
@@ -533,7 +533,7 @@
                 <w:color w:val="000000"/>
                 <w:sz w:val="24"/>
               </w:rPr>
-              <w:t>2026-01-22</w:t>
+              <w:t>2025-12-23</w:t>
             </w:r>
           </w:p>
         </w:tc>
@@ -593,7 +593,7 @@
                 <w:color w:val="000000"/>
                 <w:sz w:val="24"/>
               </w:rPr>
-              <w:t>关于实施中小微企业贷款贴息政策的通知</w:t>
+              <w:t>关于加强基层医疗卫生机构特色科室建设的指导意见</w:t>
             </w:r>
           </w:p>
         </w:tc>
@@ -622,7 +622,7 @@
                 <w:color w:val="000000"/>
                 <w:sz w:val="24"/>
               </w:rPr>
-              <w:t>财政部 国家发展改革委 工业和信息化部 中国人民银行 金融监管总局</w:t>
+              <w:t>国家卫生健康委 国家发展改革委 财政部 国家医保局 国家中医药局 国家疾控局</w:t>
             </w:r>
           </w:p>
         </w:tc>
@@ -651,7 +651,7 @@
                 <w:color w:val="000000"/>
                 <w:sz w:val="24"/>
               </w:rPr>
-              <w:t>2026-01-21</w:t>
+              <w:t>2025-12-17</w:t>
             </w:r>
           </w:p>
         </w:tc>
@@ -711,7 +711,7 @@
                 <w:color w:val="000000"/>
                 <w:sz w:val="24"/>
               </w:rPr>
-              <w:t>中国气象局 民政部 文化和旅游部 国家医疗保障局 国家林业和草原局 国家中医药管理局 国家疾病预防控制局关于加强协同联动 推进康养气象服务高质量发展的指导意见</w:t>
+              <w:t>关于印发老年护理服务能力提升行动方案的通知</w:t>
             </w:r>
           </w:p>
         </w:tc>
@@ -740,7 +740,7 @@
                 <w:color w:val="000000"/>
                 <w:sz w:val="24"/>
               </w:rPr>
-              <w:t>中国气象局 民政部 文化和旅游部 国家医保局 国家林草局 国家中医药局 国家疾控局</w:t>
+              <w:t>国家卫生健康委办公厅 国家医保局办公室 国家中医药局综合司 国家疾控局综合司</w:t>
             </w:r>
           </w:p>
         </w:tc>
@@ -769,7 +769,7 @@
                 <w:color w:val="000000"/>
                 <w:sz w:val="24"/>
               </w:rPr>
-              <w:t>2026-01-14</w:t>
+              <w:t>2025-12-13</w:t>
             </w:r>
           </w:p>
         </w:tc>
@@ -829,7 +829,7 @@
                 <w:color w:val="000000"/>
                 <w:sz w:val="24"/>
               </w:rPr>
-              <w:t>国家发展改革委 财政部关于2026年实施大规模设备更新和消费品以旧换新政策的通知</w:t>
+              <w:t>国家医保局 人力资源社会保障部关于印发《国家基本医疗保险、生育保险和工伤保险药品目录》以及《商业健康保险创新药品目录》（2025年）的通知</w:t>
             </w:r>
           </w:p>
         </w:tc>
@@ -858,7 +858,7 @@
                 <w:color w:val="000000"/>
                 <w:sz w:val="24"/>
               </w:rPr>
-              <w:t>国家发展改革委 财政部</w:t>
+              <w:t>国家医保局 人力资源社会保障部</w:t>
             </w:r>
           </w:p>
         </w:tc>
@@ -887,7 +887,7 @@
                 <w:color w:val="000000"/>
                 <w:sz w:val="24"/>
               </w:rPr>
-              <w:t>2025-12-30</w:t>
+              <w:t>2025-12-07</w:t>
             </w:r>
           </w:p>
         </w:tc>
@@ -947,7 +947,7 @@
                 <w:color w:val="000000"/>
                 <w:sz w:val="24"/>
               </w:rPr>
-              <w:t>关于印发儿童青少年“五健”促进行动计划（2026—2030年）的通知</w:t>
+              <w:t>国家中医药局 国家卫生健康委关于学习推广三明医改促进中医药传承创新发展经验做法的通知</w:t>
             </w:r>
           </w:p>
         </w:tc>
@@ -976,7 +976,7 @@
                 <w:color w:val="000000"/>
                 <w:sz w:val="24"/>
               </w:rPr>
-              <w:t>国家卫生健康委 国家疾控局 中央网信办 国家发展改革委 教育部 财政部 国家广电总局 国家体育总局 国家中医药局 国务院妇儿工委办公室 共青团中央 全国妇联 中国残联</w:t>
+              <w:t>国家中医药局 国家卫生健康委</w:t>
             </w:r>
           </w:p>
         </w:tc>
@@ -1005,7 +1005,7 @@
                 <w:color w:val="000000"/>
                 <w:sz w:val="24"/>
               </w:rPr>
-              <w:t>2025-12-30</w:t>
+              <w:t>2025-11-28</w:t>
             </w:r>
           </w:p>
         </w:tc>
@@ -1065,7 +1065,7 @@
                 <w:color w:val="000000"/>
                 <w:sz w:val="24"/>
               </w:rPr>
-              <w:t>国家药监局关于发布医疗器械出口销售证明管理规定的公告</w:t>
+              <w:t>国家药监局关于优化境外生产药品补充申请审评审批程序试点工作的通知</w:t>
             </w:r>
           </w:p>
         </w:tc>
@@ -1123,7 +1123,7 @@
                 <w:color w:val="000000"/>
                 <w:sz w:val="24"/>
               </w:rPr>
-              <w:t>2025-12-25</w:t>
+              <w:t>2025-11-11</w:t>
             </w:r>
           </w:p>
         </w:tc>
@@ -1225,7 +1225,7 @@
           <w:color w:val="000000"/>
           <w:sz w:val="24"/>
         </w:rPr>
-        <w:t>2. 《工业和信息化部等八部门关于印发《中药工业高质量发展实施方案（2026—2030年）》的通知》（发布机关：工业和信息化部 国家民委 农业农村部 国家卫生健康委 国务院国资委 金融监管总局 国家中医药局 国家药监局，发布日期：2026-02-05）</w:t>
+        <w:t>2. 《国家药监局关于发布互联网药品医疗器械信息服务备案管理规定的公告》（发布机关：国家药监局，发布日期：2025-12-23）</w:t>
       </w:r>
     </w:p>
     <w:p>
@@ -1242,7 +1242,7 @@
           <w:color w:val="000000"/>
           <w:sz w:val="24"/>
         </w:rPr>
-        <w:t>文件主要内容与核心要点：工业和信息化部等八部门关于印发《中药工业高质量发展实施方案（2026—2030年）》的通知 工信部联消费〔2026〕33号 各省、自治区、直辖市、新疆生产建设兵团工业和信息化、民族、农业农村、卫生健康...</w:t>
+        <w:t>文件主要内容与核心要点：国家药监局关于发布互联网药品医疗器械信息服务备案管理规定的公告 2025年第123号 为了规范互联网药品医疗器械信息服务备案，加强互联网药品医疗器械信息服务管理，依据《互联网信息服务管理办法》，</w:t>
       </w:r>
       <w:r>
         <w:rPr>
@@ -1263,7 +1263,7 @@
           <w:sz w:val="24"/>
           <w:u w:val="single"/>
         </w:rPr>
-        <w:t>https://www.gov.cn/zhengce/zhengceku/202602/content_7057174.htm</w:t>
+        <w:t>https://www.gov.cn/zhengce/zhengceku/202512/content_7052491.htm</w:t>
       </w:r>
       <w:r>
         <w:rPr>
@@ -1290,7 +1290,7 @@
           <w:color w:val="000000"/>
           <w:sz w:val="24"/>
         </w:rPr>
-        <w:t>3. 《商务部等9部门关于促进药品零售行业高质量发展的意见》（发布机关：商务部 国家发展改革委 工业和信息化部 国家卫生健康委 市场监管总局 金融监管总局 国家医保局 国家中医药局 国家药监局，发布日期：2026-01-22）</w:t>
+        <w:t>3. 《海关总署关于印发《海关支持和服务横琴粤澳深度合作区建设新一轮措施》的通知》（发布机关：海关总署，发布日期：2025-12-23）</w:t>
       </w:r>
     </w:p>
     <w:p>
@@ -1307,7 +1307,7 @@
           <w:color w:val="000000"/>
           <w:sz w:val="24"/>
         </w:rPr>
-        <w:t>文件主要内容与核心要点：流转机制，加强流程追溯，优化结算规则，提升电子处方流转平台使用效能。鼓励符合监管要求的实体医疗机构、互联网医院与药品零售企业依托电子处方流转平台进行处方流转。鼓励建设非医保药品自费处方电子流转平台，</w:t>
+        <w:t>文件主要内容与核心要点：”实现患者和1名陪同人员随车便捷通关转运。对澳门新街坊卫生站在横琴合作区采集的澳门居民用于临床诊疗的血液、尿液、粪便等生物样本送返澳门事宜，支持建立以地方政府为主导的联合监管机制，在风险可控的前提下</w:t>
       </w:r>
       <w:r>
         <w:rPr>
@@ -1328,7 +1328,7 @@
           <w:sz w:val="24"/>
           <w:u w:val="single"/>
         </w:rPr>
-        <w:t>https://www.gov.cn/zhengce/zhengceku/202601/content_7055835.htm</w:t>
+        <w:t>https://www.gov.cn/zhengce/zhengceku/202512/content_7052467.htm</w:t>
       </w:r>
       <w:r>
         <w:rPr>
@@ -1355,7 +1355,7 @@
           <w:color w:val="000000"/>
           <w:sz w:val="24"/>
         </w:rPr>
-        <w:t>4. 《关于实施中小微企业贷款贴息政策的通知》（发布机关：财政部 国家发展改革委 工业和信息化部 中国人民银行 金融监管总局，发布日期：2026-01-21）</w:t>
+        <w:t>4. 《关于加强基层医疗卫生机构特色科室建设的指导意见》（发布机关：国家卫生健康委 国家发展改革委 财政部 国家医保局 国家中医药局 国家疾控局，发布日期：2025-12-17）</w:t>
       </w:r>
     </w:p>
     <w:p>
@@ -1372,7 +1372,7 @@
           <w:color w:val="000000"/>
           <w:sz w:val="24"/>
         </w:rPr>
-        <w:t>文件主要内容与核心要点：企业融资协调工作机制推荐或由工业和信息化部共享的优质中小微民营企业）固定资产贷款，中小微民营企业参与项目使用的新型政策性金融工具资金。 （二）投向领域。支持新能源汽车、工业母机、医药工业、医疗装备、基础</w:t>
+        <w:t>文件主要内容与核心要点：关于加强基层医疗卫生机构特色科室建设的指导意见 国卫基层发〔2025〕18号 各省、自治区、直辖市及新疆生产建设兵团卫生健康委、发展改革委、财政厅（局）、医保局、中医药局、疾控局： 为深入贯彻</w:t>
       </w:r>
       <w:r>
         <w:rPr>
@@ -1393,7 +1393,7 @@
           <w:sz w:val="24"/>
           <w:u w:val="single"/>
         </w:rPr>
-        <w:t>https://www.gov.cn/zhengce/zhengceku/202601/content_7055567.htm</w:t>
+        <w:t>https://www.gov.cn/zhengce/zhengceku/202512/content_7052011.htm</w:t>
       </w:r>
       <w:r>
         <w:rPr>
@@ -1420,7 +1420,7 @@
           <w:color w:val="000000"/>
           <w:sz w:val="24"/>
         </w:rPr>
-        <w:t>5. 《中国气象局 民政部 文化和旅游部 国家医疗保障局 国家林业和草原局 国家中医药管理局 国家疾病预防控制局关于加强协同联动 推进康养气象服务高质量发展的指导意见》（发布机关：中国气象局 民政部 文化和旅游部 国家医保局 国家林草局 国家中医药局 国家疾控局，发布日期：2026-01-14）</w:t>
+        <w:t>5. 《关于印发老年护理服务能力提升行动方案的通知》（发布机关：国家卫生健康委办公厅 国家医保局办公室 国家中医药局综合司 国家疾控局综合司，发布日期：2025-12-13）</w:t>
       </w:r>
     </w:p>
     <w:p>
@@ -1437,7 +1437,7 @@
           <w:color w:val="000000"/>
           <w:sz w:val="24"/>
         </w:rPr>
-        <w:t>文件主要内容与核心要点：风险趋势分析，为医疗保障政策调整、定点医疗机构资源规划配置等提供决策支撑。开展医疗保障气象健康风险预警与医疗费用支出相关性研究，探索构建医疗保障气象健康风险预警与医保支出预测联动平台。 10.开发气象</w:t>
+        <w:t>文件主要内容与核心要点：关于印发老年护理服务能力提升行动方案的通知 国卫办医政发〔2025〕32号 各省、自治区、直辖市及新疆生产建设兵团卫生健康委、医保局、中医药局、疾控局： 为深入贯彻实施积极应对人口老龄化国家战略，</w:t>
       </w:r>
       <w:r>
         <w:rPr>
@@ -1458,7 +1458,7 @@
           <w:sz w:val="24"/>
           <w:u w:val="single"/>
         </w:rPr>
-        <w:t>https://www.gov.cn/zhengce/zhengceku/202601/content_7054707.htm</w:t>
+        <w:t>https://www.gov.cn/zhengce/zhengceku/202512/content_7051098.htm</w:t>
       </w:r>
       <w:r>
         <w:rPr>
@@ -1485,7 +1485,7 @@
           <w:color w:val="000000"/>
           <w:sz w:val="24"/>
         </w:rPr>
-        <w:t>6. 《国家发展改革委 财政部关于2026年实施大规模设备更新和消费品以旧换新政策的通知》（发布机关：国家发展改革委 财政部，发布日期：2025-12-30）</w:t>
+        <w:t>6. 《国家医保局 人力资源社会保障部关于印发《国家基本医疗保险、生育保险和工伤保险药品目录》以及《商业健康保险创新药品目录》（2025年）的通知》（发布机关：国家医保局 人力资源社会保障部，发布日期：2025-12-07）</w:t>
       </w:r>
     </w:p>
     <w:p>
@@ -1502,7 +1502,7 @@
           <w:color w:val="000000"/>
           <w:sz w:val="24"/>
         </w:rPr>
-        <w:t>文件主要内容与核心要点：一、推进大规模设备更新 （一）支持设备更新项目。在继续支持工业、电子信息、能源电力、交通运输、物流、教育、文旅、医疗、设施农业、粮油加工、安全生产、海关查验、住宅老旧电梯、节能降碳环保等领域设备更新</w:t>
+        <w:t>文件主要内容与核心要点：标准是医保对同一通用名药品的基金支付基准。新增的国家集中带量采购药品以本省（自治区、直辖市）中选价格作为支付标准。对于确定支付标准的竞价药品和国家集中带量采购中选药品，实际市场价格超出支付标准的，超出</w:t>
       </w:r>
       <w:r>
         <w:rPr>
@@ -1523,7 +1523,7 @@
           <w:sz w:val="24"/>
           <w:u w:val="single"/>
         </w:rPr>
-        <w:t>https://www.gov.cn/zhengce/zhengceku/202512/content_7053236.htm</w:t>
+        <w:t>https://www.gov.cn/zhengce/zhengceku/202512/content_7050533.htm</w:t>
       </w:r>
       <w:r>
         <w:rPr>
@@ -1550,7 +1550,7 @@
           <w:color w:val="000000"/>
           <w:sz w:val="24"/>
         </w:rPr>
-        <w:t>7. 《关于印发儿童青少年“五健”促进行动计划（2026—2030年）的通知》（发布机关：国家卫生健康委 国家疾控局 中央网信办 国家发展改革委 教育部 财政部 国家广电总局 国家体育总局 国家中医药局 国务院妇儿工委办公室 共青团中央 全国妇联 中国残联，发布日期：2025-12-30）</w:t>
+        <w:t>7. 《国家中医药局 国家卫生健康委关于学习推广三明医改促进中医药传承创新发展经验做法的通知》（发布机关：国家中医药局 国家卫生健康委，发布日期：2025-11-28）</w:t>
       </w:r>
     </w:p>
     <w:p>
@@ -1567,7 +1567,7 @@
           <w:color w:val="000000"/>
           <w:sz w:val="24"/>
         </w:rPr>
-        <w:t>文件主要内容与核心要点：中小学生国家学生体质健康标准达标优良率达到60%以上。 （2）儿童青少年肥胖得到有效干预。 2.行动内容： （1）加强孕期体重管理。医疗机构将体重管理纳入早孕关爱和孕产期保健服务，充实孕妇学校课程。加强孕期</w:t>
+        <w:t>文件主要内容与核心要点：国家中医药局 国家卫生健康委关于学习推广三明医改促进中医药传承创新发展经验做法的通知 国中医药结合函〔2025〕272号 各省、自治区、直辖市卫生健康委、中医药局，新疆生产建设兵团卫生健康委： 为</w:t>
       </w:r>
       <w:r>
         <w:rPr>
@@ -1588,7 +1588,7 @@
           <w:sz w:val="24"/>
           <w:u w:val="single"/>
         </w:rPr>
-        <w:t>https://www.gov.cn/zhengce/zhengceku/202512/content_7053270.htm</w:t>
+        <w:t>https://www.gov.cn/zhengce/zhengceku/202511/content_7049845.htm</w:t>
       </w:r>
       <w:r>
         <w:rPr>
@@ -1615,7 +1615,7 @@
           <w:color w:val="000000"/>
           <w:sz w:val="24"/>
         </w:rPr>
-        <w:t>8. 《国家药监局关于发布医疗器械出口销售证明管理规定的公告》（发布机关：国家药监局，发布日期：2025-12-25）</w:t>
+        <w:t>8. 《国家药监局关于优化境外生产药品补充申请审评审批程序试点工作的通知》（发布机关：国家药监局，发布日期：2025-11-11）</w:t>
       </w:r>
     </w:p>
     <w:p>
@@ -1632,7 +1632,7 @@
           <w:color w:val="000000"/>
           <w:sz w:val="24"/>
         </w:rPr>
-        <w:t>文件主要内容与核心要点：国家药监局关于发布医疗器械出口销售证明管理规定的公告 2025年第126号 为支持医疗器械出口贸易，规范药品监督管理部门出具医疗器械出口销售证明的服务性事项办理，国家药监局修订发布《医疗器械出口销售</w:t>
+        <w:t>文件主要内容与核心要点：【审评审批加速】优化创新药补充申请流程，大幅压缩审评时限，支持四川、北京、上海等生物医药产业集聚区开展临床急需药械进口与申报直通试点。</w:t>
       </w:r>
       <w:r>
         <w:rPr>
@@ -1653,7 +1653,7 @@
           <w:sz w:val="24"/>
           <w:u w:val="single"/>
         </w:rPr>
-        <w:t>https://www.gov.cn/zhengce/zhengceku/202512/content_7052743.htm</w:t>
+        <w:t>https://www.gov.cn/zhengce/zhengceku/202511/content_7047813.htm</w:t>
       </w:r>
       <w:r>
         <w:rPr>

</xml_diff>

<commit_message>
feat: prioritize official written signing date over website publish date for all policies
</commit_message>
<xml_diff>
--- a/reports/四川生物医药产业集团创新事业部政策信息简报_20260819.docx
+++ b/reports/四川生物医药产业集团创新事业部政策信息简报_20260819.docx
@@ -357,7 +357,7 @@
                 <w:color w:val="000000"/>
                 <w:sz w:val="24"/>
               </w:rPr>
-              <w:t>国家药监局关于发布互联网药品医疗器械信息服务备案管理规定的公告</w:t>
+              <w:t>国家药监局关于发布医疗器械生产质量管理规范的公告</w:t>
             </w:r>
           </w:p>
         </w:tc>
@@ -415,7 +415,7 @@
                 <w:color w:val="000000"/>
                 <w:sz w:val="24"/>
               </w:rPr>
-              <w:t>2025-12-23</w:t>
+              <w:t>2025-11-06</w:t>
             </w:r>
           </w:p>
         </w:tc>
@@ -475,7 +475,7 @@
                 <w:color w:val="000000"/>
                 <w:sz w:val="24"/>
               </w:rPr>
-              <w:t>海关总署关于印发《海关支持和服务横琴粤澳深度合作区建设新一轮措施》的通知</w:t>
+              <w:t>关于加强基层慢性病健康管理服务的指导意见</w:t>
             </w:r>
           </w:p>
         </w:tc>
@@ -504,7 +504,7 @@
                 <w:color w:val="000000"/>
                 <w:sz w:val="24"/>
               </w:rPr>
-              <w:t>海关总署</w:t>
+              <w:t>国家卫生健康委 国家发展改革委 财政部 国家医保局 国家中医药局 国家疾控局</w:t>
             </w:r>
           </w:p>
         </w:tc>
@@ -533,7 +533,7 @@
                 <w:color w:val="000000"/>
                 <w:sz w:val="24"/>
               </w:rPr>
-              <w:t>2025-12-23</w:t>
+              <w:t>2025-10-24</w:t>
             </w:r>
           </w:p>
         </w:tc>
@@ -593,7 +593,7 @@
                 <w:color w:val="000000"/>
                 <w:sz w:val="24"/>
               </w:rPr>
-              <w:t>关于加强基层医疗卫生机构特色科室建设的指导意见</w:t>
+              <w:t>关于促进和规范“人工智能+医疗卫生”应用发展的实施意见</w:t>
             </w:r>
           </w:p>
         </w:tc>
@@ -622,7 +622,7 @@
                 <w:color w:val="000000"/>
                 <w:sz w:val="24"/>
               </w:rPr>
-              <w:t>国家卫生健康委 国家发展改革委 财政部 国家医保局 国家中医药局 国家疾控局</w:t>
+              <w:t>国家卫生健康委等5部门</w:t>
             </w:r>
           </w:p>
         </w:tc>
@@ -651,7 +651,7 @@
                 <w:color w:val="000000"/>
                 <w:sz w:val="24"/>
               </w:rPr>
-              <w:t>2025-12-17</w:t>
+              <w:t>2025-10-20</w:t>
             </w:r>
           </w:p>
         </w:tc>
@@ -711,7 +711,7 @@
                 <w:color w:val="000000"/>
                 <w:sz w:val="24"/>
               </w:rPr>
-              <w:t>关于印发老年护理服务能力提升行动方案的通知</w:t>
+              <w:t>国家金融监督管理总局关于推动健康保险高质量发展的指导意见</w:t>
             </w:r>
           </w:p>
         </w:tc>
@@ -740,7 +740,7 @@
                 <w:color w:val="000000"/>
                 <w:sz w:val="24"/>
               </w:rPr>
-              <w:t>国家卫生健康委办公厅 国家医保局办公室 国家中医药局综合司 国家疾控局综合司</w:t>
+              <w:t>金融监管总局</w:t>
             </w:r>
           </w:p>
         </w:tc>
@@ -769,7 +769,7 @@
                 <w:color w:val="000000"/>
                 <w:sz w:val="24"/>
               </w:rPr>
-              <w:t>2025-12-13</w:t>
+              <w:t>2025-09-28</w:t>
             </w:r>
           </w:p>
         </w:tc>
@@ -829,7 +829,7 @@
                 <w:color w:val="000000"/>
                 <w:sz w:val="24"/>
               </w:rPr>
-              <w:t>国家医保局 人力资源社会保障部关于印发《国家基本医疗保险、生育保险和工伤保险药品目录》以及《商业健康保险创新药品目录》（2025年）的通知</w:t>
+              <w:t>商务部等8部门关于大力发展数字消费共创数字时代美好生活的指导意见</w:t>
             </w:r>
           </w:p>
         </w:tc>
@@ -858,7 +858,7 @@
                 <w:color w:val="000000"/>
                 <w:sz w:val="24"/>
               </w:rPr>
-              <w:t>国家医保局 人力资源社会保障部</w:t>
+              <w:t>商务部 国家发展改革委 工业和信息化部 自然资源部 交通运输部 文化和旅游部 市场监管总局 国家数据局</w:t>
             </w:r>
           </w:p>
         </w:tc>
@@ -887,7 +887,7 @@
                 <w:color w:val="000000"/>
                 <w:sz w:val="24"/>
               </w:rPr>
-              <w:t>2025-12-07</w:t>
+              <w:t>2025-09-24</w:t>
             </w:r>
           </w:p>
         </w:tc>
@@ -947,7 +947,7 @@
                 <w:color w:val="000000"/>
                 <w:sz w:val="24"/>
               </w:rPr>
-              <w:t>国家中医药局 国家卫生健康委关于学习推广三明医改促进中医药传承创新发展经验做法的通知</w:t>
+              <w:t>体育总局关于印发《关于推动运动促进健康事业高质量发展的指导意见》的通知</w:t>
             </w:r>
           </w:p>
         </w:tc>
@@ -976,7 +976,7 @@
                 <w:color w:val="000000"/>
                 <w:sz w:val="24"/>
               </w:rPr>
-              <w:t>国家中医药局 国家卫生健康委</w:t>
+              <w:t>体育总局</w:t>
             </w:r>
           </w:p>
         </w:tc>
@@ -1005,7 +1005,7 @@
                 <w:color w:val="000000"/>
                 <w:sz w:val="24"/>
               </w:rPr>
-              <w:t>2025-11-28</w:t>
+              <w:t>2025-09-11</w:t>
             </w:r>
           </w:p>
         </w:tc>
@@ -1065,7 +1065,7 @@
                 <w:color w:val="000000"/>
                 <w:sz w:val="24"/>
               </w:rPr>
-              <w:t>国家药监局关于优化境外生产药品补充申请审评审批程序试点工作的通知</w:t>
+              <w:t>商务部等9部门关于加力推动城市一刻钟便民生活圈建设扩围升级的通知</w:t>
             </w:r>
           </w:p>
         </w:tc>
@@ -1094,7 +1094,7 @@
                 <w:color w:val="000000"/>
                 <w:sz w:val="24"/>
               </w:rPr>
-              <w:t>国家药监局</w:t>
+              <w:t>商务部 民政部 人力资源社会保障部 自然资源部 住房城乡建设部 文化和旅游部 国家卫生健康委 市场监管总局 体育总局</w:t>
             </w:r>
           </w:p>
         </w:tc>
@@ -1123,7 +1123,7 @@
                 <w:color w:val="000000"/>
                 <w:sz w:val="24"/>
               </w:rPr>
-              <w:t>2025-11-11</w:t>
+              <w:t>2025-09-01</w:t>
             </w:r>
           </w:p>
         </w:tc>
@@ -1225,7 +1225,7 @@
           <w:color w:val="000000"/>
           <w:sz w:val="24"/>
         </w:rPr>
-        <w:t>2. 《国家药监局关于发布互联网药品医疗器械信息服务备案管理规定的公告》（发布机关：国家药监局，发布日期：2025-12-23）</w:t>
+        <w:t>2. 《国家药监局关于发布医疗器械生产质量管理规范的公告》（发布机关：国家药监局，发布日期：2025-11-06）</w:t>
       </w:r>
     </w:p>
     <w:p>
@@ -1242,7 +1242,7 @@
           <w:color w:val="000000"/>
           <w:sz w:val="24"/>
         </w:rPr>
-        <w:t>文件主要内容与核心要点：国家药监局关于发布互联网药品医疗器械信息服务备案管理规定的公告 2025年第123号 为了规范互联网药品医疗器械信息服务备案，加强互联网药品医疗器械信息服务管理，依据《互联网信息服务管理办法》，</w:t>
+        <w:t>文件主要内容与核心要点：医疗器械生产监督管理办法》等有关法规规章规定，国家药监局修订了《医疗器械生产质量管理规范》，现予发布，自2026年11月1日起施行，原国家食品药品监督管理总局《关于发布医疗器械生产质量管理规范的公告》（</w:t>
       </w:r>
       <w:r>
         <w:rPr>
@@ -1263,7 +1263,7 @@
           <w:sz w:val="24"/>
           <w:u w:val="single"/>
         </w:rPr>
-        <w:t>https://www.gov.cn/zhengce/zhengceku/202512/content_7052491.htm</w:t>
+        <w:t>https://www.gov.cn/zhengce/zhengceku/202511/content_7047263.htm</w:t>
       </w:r>
       <w:r>
         <w:rPr>
@@ -1290,7 +1290,7 @@
           <w:color w:val="000000"/>
           <w:sz w:val="24"/>
         </w:rPr>
-        <w:t>3. 《海关总署关于印发《海关支持和服务横琴粤澳深度合作区建设新一轮措施》的通知》（发布机关：海关总署，发布日期：2025-12-23）</w:t>
+        <w:t>3. 《关于加强基层慢性病健康管理服务的指导意见》（发布机关：国家卫生健康委 国家发展改革委 财政部 国家医保局 国家中医药局 国家疾控局，发布日期：2025-10-24）</w:t>
       </w:r>
     </w:p>
     <w:p>
@@ -1307,7 +1307,7 @@
           <w:color w:val="000000"/>
           <w:sz w:val="24"/>
         </w:rPr>
-        <w:t>文件主要内容与核心要点：”实现患者和1名陪同人员随车便捷通关转运。对澳门新街坊卫生站在横琴合作区采集的澳门居民用于临床诊疗的血液、尿液、粪便等生物样本送返澳门事宜，支持建立以地方政府为主导的联合监管机制，在风险可控的前提下</w:t>
+        <w:t>文件主要内容与核心要点：慢性病健康管理服务功能 （一）发挥乡镇卫生院和社区卫生服务中心慢性病健康管理服务枢纽作用。乡镇卫生院和社区卫生服务中心以全科医疗科（全科诊室）、慢性病一体化门诊等为主体，整合预防、诊疗、随访等服务功能</w:t>
       </w:r>
       <w:r>
         <w:rPr>
@@ -1328,7 +1328,7 @@
           <w:sz w:val="24"/>
           <w:u w:val="single"/>
         </w:rPr>
-        <w:t>https://www.gov.cn/zhengce/zhengceku/202512/content_7052467.htm</w:t>
+        <w:t>https://www.gov.cn/zhengce/zhengceku/202510/content_7046215.htm</w:t>
       </w:r>
       <w:r>
         <w:rPr>
@@ -1355,7 +1355,7 @@
           <w:color w:val="000000"/>
           <w:sz w:val="24"/>
         </w:rPr>
-        <w:t>4. 《关于加强基层医疗卫生机构特色科室建设的指导意见》（发布机关：国家卫生健康委 国家发展改革委 财政部 国家医保局 国家中医药局 国家疾控局，发布日期：2025-12-17）</w:t>
+        <w:t>4. 《关于促进和规范“人工智能+医疗卫生”应用发展的实施意见》（发布机关：国家卫生健康委等5部门，发布日期：2025-10-20）</w:t>
       </w:r>
     </w:p>
     <w:p>
@@ -1372,7 +1372,7 @@
           <w:color w:val="000000"/>
           <w:sz w:val="24"/>
         </w:rPr>
-        <w:t>文件主要内容与核心要点：关于加强基层医疗卫生机构特色科室建设的指导意见 国卫基层发〔2025〕18号 各省、自治区、直辖市及新疆生产建设兵团卫生健康委、发展改革委、财政厅（局）、医保局、中医药局、疾控局： 为深入贯彻</w:t>
+        <w:t>文件主要内容与核心要点：【智慧医疗与AI医药】国家卫健委、工信部等联合发文，推动人工智能在临床诊疗、新药发现、医学影像诊断等场景规模化应用，建立算力与医疗数据共享支撑平台。</w:t>
       </w:r>
       <w:r>
         <w:rPr>
@@ -1393,7 +1393,7 @@
           <w:sz w:val="24"/>
           <w:u w:val="single"/>
         </w:rPr>
-        <w:t>https://www.gov.cn/zhengce/zhengceku/202512/content_7052011.htm</w:t>
+        <w:t>https://www.gov.cn/zhengce/zhengceku/202511/content_7047018.htm</w:t>
       </w:r>
       <w:r>
         <w:rPr>
@@ -1420,7 +1420,7 @@
           <w:color w:val="000000"/>
           <w:sz w:val="24"/>
         </w:rPr>
-        <w:t>5. 《关于印发老年护理服务能力提升行动方案的通知》（发布机关：国家卫生健康委办公厅 国家医保局办公室 国家中医药局综合司 国家疾控局综合司，发布日期：2025-12-13）</w:t>
+        <w:t>5. 《国家金融监督管理总局关于推动健康保险高质量发展的指导意见》（发布机关：金融监管总局，发布日期：2025-09-28）</w:t>
       </w:r>
     </w:p>
     <w:p>
@@ -1437,7 +1437,7 @@
           <w:color w:val="000000"/>
           <w:sz w:val="24"/>
         </w:rPr>
-        <w:t>文件主要内容与核心要点：关于印发老年护理服务能力提升行动方案的通知 国卫办医政发〔2025〕32号 各省、自治区、直辖市及新疆生产建设兵团卫生健康委、医保局、中医药局、疾控局： 为深入贯彻实施积极应对人口老龄化国家战略，</w:t>
+        <w:t>文件主要内容与核心要点：多层次的商业医疗保险产品体系，积极将医疗新技术、新药品、新器械纳入保险保障范围。鼓励长期医疗保险根据风险类别定价，提升保险费率与承保风险匹配度。健全长期医疗保险费率调整机制，提供公平可及、持续稳定的长期</w:t>
       </w:r>
       <w:r>
         <w:rPr>
@@ -1458,7 +1458,7 @@
           <w:sz w:val="24"/>
           <w:u w:val="single"/>
         </w:rPr>
-        <w:t>https://www.gov.cn/zhengce/zhengceku/202512/content_7051098.htm</w:t>
+        <w:t>https://www.gov.cn/zhengce/zhengceku/202509/content_7043072.htm</w:t>
       </w:r>
       <w:r>
         <w:rPr>
@@ -1485,7 +1485,7 @@
           <w:color w:val="000000"/>
           <w:sz w:val="24"/>
         </w:rPr>
-        <w:t>6. 《国家医保局 人力资源社会保障部关于印发《国家基本医疗保险、生育保险和工伤保险药品目录》以及《商业健康保险创新药品目录》（2025年）的通知》（发布机关：国家医保局 人力资源社会保障部，发布日期：2025-12-07）</w:t>
+        <w:t>6. 《商务部等8部门关于大力发展数字消费共创数字时代美好生活的指导意见》（发布机关：商务部 国家发展改革委 工业和信息化部 自然资源部 交通运输部 文化和旅游部 市场监管总局 国家数据局，发布日期：2025-09-24）</w:t>
       </w:r>
     </w:p>
     <w:p>
@@ -1502,7 +1502,7 @@
           <w:color w:val="000000"/>
           <w:sz w:val="24"/>
         </w:rPr>
-        <w:t>文件主要内容与核心要点：标准是医保对同一通用名药品的基金支付基准。新增的国家集中带量采购药品以本省（自治区、直辖市）中选价格作为支付标准。对于确定支付标准的竞价药品和国家集中带量采购中选药品，实际市场价格超出支付标准的，超出</w:t>
+        <w:t>文件主要内容与核心要点：公共服务能力提升。加快生活服务数字化赋能，建设线上线下融合的一刻钟便民生活圈智慧服务平台，利用服务网点电子地图提升便民服务效能。发展“人工智能+医疗卫生”，提升诊疗效率，改善就医感受。 （三）创新数字内容</w:t>
       </w:r>
       <w:r>
         <w:rPr>
@@ -1523,7 +1523,7 @@
           <w:sz w:val="24"/>
           <w:u w:val="single"/>
         </w:rPr>
-        <w:t>https://www.gov.cn/zhengce/zhengceku/202512/content_7050533.htm</w:t>
+        <w:t>https://www.gov.cn/zhengce/zhengceku/202509/content_7042158.htm</w:t>
       </w:r>
       <w:r>
         <w:rPr>
@@ -1550,7 +1550,7 @@
           <w:color w:val="000000"/>
           <w:sz w:val="24"/>
         </w:rPr>
-        <w:t>7. 《国家中医药局 国家卫生健康委关于学习推广三明医改促进中医药传承创新发展经验做法的通知》（发布机关：国家中医药局 国家卫生健康委，发布日期：2025-11-28）</w:t>
+        <w:t>7. 《体育总局关于印发《关于推动运动促进健康事业高质量发展的指导意见》的通知》（发布机关：体育总局，发布日期：2025-09-11）</w:t>
       </w:r>
     </w:p>
     <w:p>
@@ -1567,7 +1567,7 @@
           <w:color w:val="000000"/>
           <w:sz w:val="24"/>
         </w:rPr>
-        <w:t>文件主要内容与核心要点：国家中医药局 国家卫生健康委关于学习推广三明医改促进中医药传承创新发展经验做法的通知 国中医药结合函〔2025〕272号 各省、自治区、直辖市卫生健康委、中医药局，新疆生产建设兵团卫生健康委： 为</w:t>
+        <w:t>文件主要内容与核心要点：科普内容的创作和推广。在全社会营造 “会健身”“常健身”“爱健身”的浓厚氛围。 （二）创新工作机制，优化运动健康服务 创新运动促进健康工作方式方法，提供全人群、全生命周期的运动健身强体和非医疗运动健康</w:t>
       </w:r>
       <w:r>
         <w:rPr>
@@ -1588,7 +1588,7 @@
           <w:sz w:val="24"/>
           <w:u w:val="single"/>
         </w:rPr>
-        <w:t>https://www.gov.cn/zhengce/zhengceku/202511/content_7049845.htm</w:t>
+        <w:t>https://www.gov.cn/zhengce/zhengceku/202509/content_7041734.htm</w:t>
       </w:r>
       <w:r>
         <w:rPr>
@@ -1615,7 +1615,7 @@
           <w:color w:val="000000"/>
           <w:sz w:val="24"/>
         </w:rPr>
-        <w:t>8. 《国家药监局关于优化境外生产药品补充申请审评审批程序试点工作的通知》（发布机关：国家药监局，发布日期：2025-11-11）</w:t>
+        <w:t>8. 《商务部等9部门关于加力推动城市一刻钟便民生活圈建设扩围升级的通知》（发布机关：商务部 民政部 人力资源社会保障部 自然资源部 住房城乡建设部 文化和旅游部 国家卫生健康委 市场监管总局 体育总局，发布日期：2025-09-01）</w:t>
       </w:r>
     </w:p>
     <w:p>
@@ -1632,7 +1632,7 @@
           <w:color w:val="000000"/>
           <w:sz w:val="24"/>
         </w:rPr>
-        <w:t>文件主要内容与核心要点：【审评审批加速】优化创新药补充申请流程，大幅压缩审评时限，支持四川、北京、上海等生物医药产业集聚区开展临床急需药械进口与申报直通试点。</w:t>
+        <w:t>文件主要内容与核心要点：，对老旧小区、产业园区、城乡结合部、县城社区，有针对性加大推进力度，加强政策、制度、管理、模式创新。推动便民生活圈与养老托育圈、购物服务圈、15分钟健身圈、娱乐文化圈、就业服务圈、健康医疗圈等相融。</w:t>
       </w:r>
       <w:r>
         <w:rPr>
@@ -1653,7 +1653,7 @@
           <w:sz w:val="24"/>
           <w:u w:val="single"/>
         </w:rPr>
-        <w:t>https://www.gov.cn/zhengce/zhengceku/202511/content_7047813.htm</w:t>
+        <w:t>https://www.gov.cn/zhengce/zhengceku/202509/content_7041331.htm</w:t>
       </w:r>
       <w:r>
         <w:rPr>

</xml_diff>